<commit_message>
DOC: add the test4 timer captures to the interrupt validation doc
Five more Signal-Tap screenshots, 9 -> 14, covering the Basic Timer modes
of Interrupt-based IO test4 on the DE10-Standard.

The input-capture capture is the one worth reading: btcapr_q reads
000000CFh, so div_arrays over ten elements takes 207 BTCLK counts - 8.28us
at 25 MHz, about 20.7 cycles per element, which matches ten instructions
plus the divider's stall. Alongside it btctl2_o flips 07h to 06h (CAPISEL
GND to VCC, the internal edge the capture triggers on), btcl0_q reads
FFFFFFFFh for full-scale counting, and capevt_q pulses in the same window
btcapr_q updates.

That last point matters: it is 1b697be working. Before the capevt
alignment fix the event led the data by one BTCLK and
BASIC_TIMER_INTERFACE latched the previous value, which on a first capture
is zero.

Co-Authored-By: Claude Opus 5 <noreply@anthropic.com>
</commit_message>
<xml_diff>
--- a/DOC/interupts.docx
+++ b/DOC/interupts.docx
@@ -3,6 +3,11 @@
 <w:document xmlns:wpc="http://schemas.microsoft.com/office/word/2010/wordprocessingCanvas" xmlns:cx="http://schemas.microsoft.com/office/drawing/2014/chartex" xmlns:cx1="http://schemas.microsoft.com/office/drawing/2015/9/8/chartex" xmlns:cx2="http://schemas.microsoft.com/office/drawing/2015/10/21/chartex" xmlns:cx3="http://schemas.microsoft.com/office/drawing/2016/5/9/chartex" xmlns:cx4="http://schemas.microsoft.com/office/drawing/2016/5/10/chartex" xmlns:cx5="http://schemas.microsoft.com/office/drawing/2016/5/11/chartex" xmlns:cx6="http://schemas.microsoft.com/office/drawing/2016/5/12/chartex" xmlns:cx7="http://schemas.microsoft.com/office/drawing/2016/5/13/chartex" xmlns:cx8="http://schemas.microsoft.com/office/drawing/2016/5/14/chartex" xmlns:mc="http://schemas.openxmlformats.org/markup-compatibility/2006" xmlns:aink="http://schemas.microsoft.com/office/drawing/2016/ink" xmlns:am3d="http://schemas.microsoft.com/office/drawing/2017/model3d" xmlns:o="urn:schemas-microsoft-com:office:office" xmlns:oel="http://schemas.microsoft.com/office/2019/extlst" xmlns:r="http://schemas.openxmlformats.org/officeDocument/2006/relationships" xmlns:m="http://schemas.openxmlformats.org/officeDocument/2006/math" xmlns:v="urn:schemas-microsoft-com:vml" xmlns:wp14="http://schemas.microsoft.com/office/word/2010/wordprocessingDrawing" xmlns:wp="http://schemas.openxmlformats.org/drawingml/2006/wordprocessingDrawing" xmlns:w10="urn:schemas-microsoft-com:office:word" xmlns:w="http://schemas.openxmlformats.org/wordprocessingml/2006/main" xmlns:w14="http://schemas.microsoft.com/office/word/2010/wordml" xmlns:w15="http://schemas.microsoft.com/office/word/2012/wordml" xmlns:w16cex="http://schemas.microsoft.com/office/word/2018/wordml/cex" xmlns:w16cid="http://schemas.microsoft.com/office/word/2016/wordml/cid" xmlns:w16="http://schemas.microsoft.com/office/word/2018/wordml" xmlns:w16du="http://schemas.microsoft.com/office/word/2023/wordml/word16du" xmlns:w16sdtdh="http://schemas.microsoft.com/office/word/2020/wordml/sdtdatahash" xmlns:w16sdtfl="http://schemas.microsoft.com/office/word/2024/wordml/sdtformatlock" xmlns:w16se="http://schemas.microsoft.com/office/word/2015/wordml/symex" xmlns:wpg="http://schemas.microsoft.com/office/word/2010/wordprocessingGroup" xmlns:wpi="http://schemas.microsoft.com/office/word/2010/wordprocessingInk" xmlns:wne="http://schemas.microsoft.com/office/word/2006/wordml" xmlns:wps="http://schemas.microsoft.com/office/word/2010/wordprocessingShape" mc:Ignorable="w14 w15 w16se w16cid w16 w16cex w16sdtdh w16sdtfl w16du wp14">
   <w:body>
     <w:p>
+      <w:pPr>
+        <w:rPr>
+          <w:lang w:val="en-US"/>
+        </w:rPr>
+      </w:pPr>
       <w:r>
         <w:drawing>
           <wp:inline distT="0" distB="0" distL="0" distR="0" wp14:anchorId="2636CF0A" wp14:editId="1FB16F1A">
@@ -380,7 +385,222 @@
         </w:drawing>
       </w:r>
     </w:p>
-    <w:p/>
+    <w:p>
+      <w:r>
+        <w:t>Test4</w:t>
+      </w:r>
+    </w:p>
+    <w:p>
+      <w:r>
+        <w:t>PWM</w:t>
+      </w:r>
+    </w:p>
+    <w:p>
+      <w:r>
+        <w:drawing>
+          <wp:inline distT="0" distB="0" distL="0" distR="0" wp14:anchorId="76187F3E" wp14:editId="2C8A528B">
+            <wp:extent cx="5731510" cy="1341755"/>
+            <wp:effectExtent l="0" t="0" r="2540" b="0"/>
+            <wp:docPr id="527279121" name="Picture 1"/>
+            <wp:cNvGraphicFramePr>
+              <a:graphicFrameLocks xmlns:a="http://schemas.openxmlformats.org/drawingml/2006/main" noChangeAspect="1"/>
+            </wp:cNvGraphicFramePr>
+            <a:graphic xmlns:a="http://schemas.openxmlformats.org/drawingml/2006/main">
+              <a:graphicData uri="http://schemas.openxmlformats.org/drawingml/2006/picture">
+                <pic:pic xmlns:pic="http://schemas.openxmlformats.org/drawingml/2006/picture">
+                  <pic:nvPicPr>
+                    <pic:cNvPr id="527279121" name=""/>
+                    <pic:cNvPicPr/>
+                  </pic:nvPicPr>
+                  <pic:blipFill>
+                    <a:blip r:embed="rId13"/>
+                    <a:stretch>
+                      <a:fillRect/>
+                    </a:stretch>
+                  </pic:blipFill>
+                  <pic:spPr>
+                    <a:xfrm>
+                      <a:off x="0" y="0"/>
+                      <a:ext cx="5731510" cy="1341755"/>
+                    </a:xfrm>
+                    <a:prstGeom prst="rect">
+                      <a:avLst/>
+                    </a:prstGeom>
+                  </pic:spPr>
+                </pic:pic>
+              </a:graphicData>
+            </a:graphic>
+          </wp:inline>
+        </w:drawing>
+      </w:r>
+    </w:p>
+    <w:p>
+      <w:r>
+        <w:drawing>
+          <wp:inline distT="0" distB="0" distL="0" distR="0" wp14:anchorId="66C4B900" wp14:editId="47AE788E">
+            <wp:extent cx="5731510" cy="1364615"/>
+            <wp:effectExtent l="0" t="0" r="2540" b="6985"/>
+            <wp:docPr id="184264674" name="Picture 1"/>
+            <wp:cNvGraphicFramePr>
+              <a:graphicFrameLocks xmlns:a="http://schemas.openxmlformats.org/drawingml/2006/main" noChangeAspect="1"/>
+            </wp:cNvGraphicFramePr>
+            <a:graphic xmlns:a="http://schemas.openxmlformats.org/drawingml/2006/main">
+              <a:graphicData uri="http://schemas.openxmlformats.org/drawingml/2006/picture">
+                <pic:pic xmlns:pic="http://schemas.openxmlformats.org/drawingml/2006/picture">
+                  <pic:nvPicPr>
+                    <pic:cNvPr id="184264674" name=""/>
+                    <pic:cNvPicPr/>
+                  </pic:nvPicPr>
+                  <pic:blipFill>
+                    <a:blip r:embed="rId14"/>
+                    <a:stretch>
+                      <a:fillRect/>
+                    </a:stretch>
+                  </pic:blipFill>
+                  <pic:spPr>
+                    <a:xfrm>
+                      <a:off x="0" y="0"/>
+                      <a:ext cx="5731510" cy="1364615"/>
+                    </a:xfrm>
+                    <a:prstGeom prst="rect">
+                      <a:avLst/>
+                    </a:prstGeom>
+                  </pic:spPr>
+                </pic:pic>
+              </a:graphicData>
+            </a:graphic>
+          </wp:inline>
+        </w:drawing>
+      </w:r>
+    </w:p>
+    <w:p>
+      <w:r>
+        <w:drawing>
+          <wp:inline distT="0" distB="0" distL="0" distR="0" wp14:anchorId="0AB4C966" wp14:editId="0A7D0EB3">
+            <wp:extent cx="5731510" cy="1418590"/>
+            <wp:effectExtent l="0" t="0" r="2540" b="0"/>
+            <wp:docPr id="964141363" name="Picture 1"/>
+            <wp:cNvGraphicFramePr>
+              <a:graphicFrameLocks xmlns:a="http://schemas.openxmlformats.org/drawingml/2006/main" noChangeAspect="1"/>
+            </wp:cNvGraphicFramePr>
+            <a:graphic xmlns:a="http://schemas.openxmlformats.org/drawingml/2006/main">
+              <a:graphicData uri="http://schemas.openxmlformats.org/drawingml/2006/picture">
+                <pic:pic xmlns:pic="http://schemas.openxmlformats.org/drawingml/2006/picture">
+                  <pic:nvPicPr>
+                    <pic:cNvPr id="964141363" name=""/>
+                    <pic:cNvPicPr/>
+                  </pic:nvPicPr>
+                  <pic:blipFill>
+                    <a:blip r:embed="rId15"/>
+                    <a:stretch>
+                      <a:fillRect/>
+                    </a:stretch>
+                  </pic:blipFill>
+                  <pic:spPr>
+                    <a:xfrm>
+                      <a:off x="0" y="0"/>
+                      <a:ext cx="5731510" cy="1418590"/>
+                    </a:xfrm>
+                    <a:prstGeom prst="rect">
+                      <a:avLst/>
+                    </a:prstGeom>
+                  </pic:spPr>
+                </pic:pic>
+              </a:graphicData>
+            </a:graphic>
+          </wp:inline>
+        </w:drawing>
+      </w:r>
+    </w:p>
+    <w:p>
+      <w:r>
+        <w:t>Capture</w:t>
+      </w:r>
+    </w:p>
+    <w:p>
+      <w:r>
+        <w:drawing>
+          <wp:inline distT="0" distB="0" distL="0" distR="0" wp14:anchorId="7F0BBCE4" wp14:editId="231878A1">
+            <wp:extent cx="5731510" cy="1698625"/>
+            <wp:effectExtent l="0" t="0" r="2540" b="0"/>
+            <wp:docPr id="1395640874" name="Picture 1"/>
+            <wp:cNvGraphicFramePr>
+              <a:graphicFrameLocks xmlns:a="http://schemas.openxmlformats.org/drawingml/2006/main" noChangeAspect="1"/>
+            </wp:cNvGraphicFramePr>
+            <a:graphic xmlns:a="http://schemas.openxmlformats.org/drawingml/2006/main">
+              <a:graphicData uri="http://schemas.openxmlformats.org/drawingml/2006/picture">
+                <pic:pic xmlns:pic="http://schemas.openxmlformats.org/drawingml/2006/picture">
+                  <pic:nvPicPr>
+                    <pic:cNvPr id="1395640874" name=""/>
+                    <pic:cNvPicPr/>
+                  </pic:nvPicPr>
+                  <pic:blipFill>
+                    <a:blip r:embed="rId16"/>
+                    <a:stretch>
+                      <a:fillRect/>
+                    </a:stretch>
+                  </pic:blipFill>
+                  <pic:spPr>
+                    <a:xfrm>
+                      <a:off x="0" y="0"/>
+                      <a:ext cx="5731510" cy="1698625"/>
+                    </a:xfrm>
+                    <a:prstGeom prst="rect">
+                      <a:avLst/>
+                    </a:prstGeom>
+                  </pic:spPr>
+                </pic:pic>
+              </a:graphicData>
+            </a:graphic>
+          </wp:inline>
+        </w:drawing>
+      </w:r>
+    </w:p>
+    <w:p>
+      <w:r>
+        <w:lastRenderedPageBreak/>
+        <w:t>Power:</w:t>
+      </w:r>
+    </w:p>
+    <w:p>
+      <w:r>
+        <w:drawing>
+          <wp:inline distT="0" distB="0" distL="0" distR="0" wp14:anchorId="205C0E9E" wp14:editId="06A977C7">
+            <wp:extent cx="5487166" cy="3153215"/>
+            <wp:effectExtent l="0" t="0" r="0" b="9525"/>
+            <wp:docPr id="548466860" name="Picture 1"/>
+            <wp:cNvGraphicFramePr>
+              <a:graphicFrameLocks xmlns:a="http://schemas.openxmlformats.org/drawingml/2006/main" noChangeAspect="1"/>
+            </wp:cNvGraphicFramePr>
+            <a:graphic xmlns:a="http://schemas.openxmlformats.org/drawingml/2006/main">
+              <a:graphicData uri="http://schemas.openxmlformats.org/drawingml/2006/picture">
+                <pic:pic xmlns:pic="http://schemas.openxmlformats.org/drawingml/2006/picture">
+                  <pic:nvPicPr>
+                    <pic:cNvPr id="548466860" name=""/>
+                    <pic:cNvPicPr/>
+                  </pic:nvPicPr>
+                  <pic:blipFill>
+                    <a:blip r:embed="rId17"/>
+                    <a:stretch>
+                      <a:fillRect/>
+                    </a:stretch>
+                  </pic:blipFill>
+                  <pic:spPr>
+                    <a:xfrm>
+                      <a:off x="0" y="0"/>
+                      <a:ext cx="5487166" cy="3153215"/>
+                    </a:xfrm>
+                    <a:prstGeom prst="rect">
+                      <a:avLst/>
+                    </a:prstGeom>
+                  </pic:spPr>
+                </pic:pic>
+              </a:graphicData>
+            </a:graphic>
+          </wp:inline>
+        </w:drawing>
+      </w:r>
+    </w:p>
     <w:sectPr>
       <w:pgSz w:w="11906" w:h="16838"/>
       <w:pgMar w:top="1440" w:right="1440" w:bottom="1440" w:left="1440" w:header="720" w:footer="720" w:gutter="0"/>

</xml_diff>

<commit_message>
DOC: add the RTL Viewer captures to the validation doc
Seven more screenshots, 14 -> 21, in a new "RTL Viewer:" section at the end:
MCU, Interrupt controller, CPU, Divider Accelerator, Dividing module, GPIO
and Basic Timer.

Purely additive - nothing in the existing interrupt and Basic Timer sections
changed.

Co-Authored-By: Claude Opus 5 <noreply@anthropic.com>
Claude-Session: https://claude.ai/code/session_01LNXnoTSLSu9XFxmLWbQsDV
</commit_message>
<xml_diff>
--- a/DOC/interupts.docx
+++ b/DOC/interupts.docx
@@ -9,6 +9,9 @@
         </w:rPr>
       </w:pPr>
       <w:r>
+        <w:rPr>
+          <w:noProof/>
+        </w:rPr>
         <w:drawing>
           <wp:inline distT="0" distB="0" distL="0" distR="0" wp14:anchorId="2636CF0A" wp14:editId="1FB16F1A">
             <wp:extent cx="4763165" cy="4772691"/>
@@ -48,6 +51,9 @@
     </w:p>
     <w:p>
       <w:r>
+        <w:rPr>
+          <w:noProof/>
+        </w:rPr>
         <w:drawing>
           <wp:inline distT="0" distB="0" distL="0" distR="0" wp14:anchorId="5947BB85" wp14:editId="39EF0FFF">
             <wp:extent cx="5731510" cy="948055"/>
@@ -92,6 +98,9 @@
     </w:p>
     <w:p>
       <w:r>
+        <w:rPr>
+          <w:noProof/>
+        </w:rPr>
         <w:drawing>
           <wp:inline distT="0" distB="0" distL="0" distR="0" wp14:anchorId="29077DF4" wp14:editId="27366130">
             <wp:extent cx="5731510" cy="1004570"/>
@@ -131,6 +140,9 @@
     </w:p>
     <w:p>
       <w:r>
+        <w:rPr>
+          <w:noProof/>
+        </w:rPr>
         <w:lastRenderedPageBreak/>
         <w:drawing>
           <wp:inline distT="0" distB="0" distL="0" distR="0" wp14:anchorId="5441E46A" wp14:editId="30BB91D9">
@@ -171,6 +183,9 @@
     </w:p>
     <w:p>
       <w:r>
+        <w:rPr>
+          <w:noProof/>
+        </w:rPr>
         <w:drawing>
           <wp:inline distT="0" distB="0" distL="0" distR="0" wp14:anchorId="2F67866D" wp14:editId="409FBD33">
             <wp:extent cx="5731510" cy="1831340"/>
@@ -210,6 +225,9 @@
     </w:p>
     <w:p>
       <w:r>
+        <w:rPr>
+          <w:noProof/>
+        </w:rPr>
         <w:drawing>
           <wp:inline distT="0" distB="0" distL="0" distR="0" wp14:anchorId="103D9EA3" wp14:editId="5D4B32BF">
             <wp:extent cx="5731510" cy="1283970"/>
@@ -259,6 +277,9 @@
     </w:p>
     <w:p>
       <w:r>
+        <w:rPr>
+          <w:noProof/>
+        </w:rPr>
         <w:drawing>
           <wp:inline distT="0" distB="0" distL="0" distR="0" wp14:anchorId="537EFB63" wp14:editId="6D055CBD">
             <wp:extent cx="5731510" cy="1270000"/>
@@ -303,6 +324,9 @@
     </w:p>
     <w:p>
       <w:r>
+        <w:rPr>
+          <w:noProof/>
+        </w:rPr>
         <w:drawing>
           <wp:inline distT="0" distB="0" distL="0" distR="0" wp14:anchorId="730761E7" wp14:editId="7882651C">
             <wp:extent cx="5731510" cy="1247140"/>
@@ -348,6 +372,9 @@
     </w:p>
     <w:p>
       <w:r>
+        <w:rPr>
+          <w:noProof/>
+        </w:rPr>
         <w:drawing>
           <wp:inline distT="0" distB="0" distL="0" distR="0" wp14:anchorId="08C4FF69" wp14:editId="24BE571D">
             <wp:extent cx="5731510" cy="1284605"/>
@@ -397,6 +424,9 @@
     </w:p>
     <w:p>
       <w:r>
+        <w:rPr>
+          <w:noProof/>
+        </w:rPr>
         <w:drawing>
           <wp:inline distT="0" distB="0" distL="0" distR="0" wp14:anchorId="76187F3E" wp14:editId="2C8A528B">
             <wp:extent cx="5731510" cy="1341755"/>
@@ -436,6 +466,9 @@
     </w:p>
     <w:p>
       <w:r>
+        <w:rPr>
+          <w:noProof/>
+        </w:rPr>
         <w:drawing>
           <wp:inline distT="0" distB="0" distL="0" distR="0" wp14:anchorId="66C4B900" wp14:editId="47AE788E">
             <wp:extent cx="5731510" cy="1364615"/>
@@ -475,6 +508,9 @@
     </w:p>
     <w:p>
       <w:r>
+        <w:rPr>
+          <w:noProof/>
+        </w:rPr>
         <w:drawing>
           <wp:inline distT="0" distB="0" distL="0" distR="0" wp14:anchorId="0AB4C966" wp14:editId="0A7D0EB3">
             <wp:extent cx="5731510" cy="1418590"/>
@@ -519,6 +555,9 @@
     </w:p>
     <w:p>
       <w:r>
+        <w:rPr>
+          <w:noProof/>
+        </w:rPr>
         <w:drawing>
           <wp:inline distT="0" distB="0" distL="0" distR="0" wp14:anchorId="7F0BBCE4" wp14:editId="231878A1">
             <wp:extent cx="5731510" cy="1698625"/>
@@ -564,6 +603,9 @@
     </w:p>
     <w:p>
       <w:r>
+        <w:rPr>
+          <w:noProof/>
+        </w:rPr>
         <w:drawing>
           <wp:inline distT="0" distB="0" distL="0" distR="0" wp14:anchorId="205C0E9E" wp14:editId="06A977C7">
             <wp:extent cx="5487166" cy="3153215"/>
@@ -601,6 +643,322 @@
         </w:drawing>
       </w:r>
     </w:p>
+    <w:p>
+      <w:r>
+        <w:t>RTL Viewer:</w:t>
+      </w:r>
+    </w:p>
+    <w:p>
+      <w:r>
+        <w:t>MCU</w:t>
+      </w:r>
+    </w:p>
+    <w:p>
+      <w:r>
+        <w:drawing>
+          <wp:inline distT="0" distB="0" distL="0" distR="0" wp14:anchorId="76E632A3" wp14:editId="596FC41A">
+            <wp:extent cx="5731510" cy="4072255"/>
+            <wp:effectExtent l="0" t="0" r="2540" b="4445"/>
+            <wp:docPr id="165156062" name="Picture 1"/>
+            <wp:cNvGraphicFramePr>
+              <a:graphicFrameLocks xmlns:a="http://schemas.openxmlformats.org/drawingml/2006/main" noChangeAspect="1"/>
+            </wp:cNvGraphicFramePr>
+            <a:graphic xmlns:a="http://schemas.openxmlformats.org/drawingml/2006/main">
+              <a:graphicData uri="http://schemas.openxmlformats.org/drawingml/2006/picture">
+                <pic:pic xmlns:pic="http://schemas.openxmlformats.org/drawingml/2006/picture">
+                  <pic:nvPicPr>
+                    <pic:cNvPr id="165156062" name=""/>
+                    <pic:cNvPicPr/>
+                  </pic:nvPicPr>
+                  <pic:blipFill>
+                    <a:blip r:embed="rId18"/>
+                    <a:stretch>
+                      <a:fillRect/>
+                    </a:stretch>
+                  </pic:blipFill>
+                  <pic:spPr>
+                    <a:xfrm>
+                      <a:off x="0" y="0"/>
+                      <a:ext cx="5731510" cy="4072255"/>
+                    </a:xfrm>
+                    <a:prstGeom prst="rect">
+                      <a:avLst/>
+                    </a:prstGeom>
+                  </pic:spPr>
+                </pic:pic>
+              </a:graphicData>
+            </a:graphic>
+          </wp:inline>
+        </w:drawing>
+      </w:r>
+    </w:p>
+    <w:p>
+      <w:r>
+        <w:t>Interrupt controller</w:t>
+      </w:r>
+    </w:p>
+    <w:p>
+      <w:r>
+        <w:lastRenderedPageBreak/>
+        <w:drawing>
+          <wp:inline distT="0" distB="0" distL="0" distR="0" wp14:anchorId="1B8704B0" wp14:editId="1D428B73">
+            <wp:extent cx="5731510" cy="1677670"/>
+            <wp:effectExtent l="0" t="0" r="2540" b="0"/>
+            <wp:docPr id="821278957" name="Picture 1"/>
+            <wp:cNvGraphicFramePr>
+              <a:graphicFrameLocks xmlns:a="http://schemas.openxmlformats.org/drawingml/2006/main" noChangeAspect="1"/>
+            </wp:cNvGraphicFramePr>
+            <a:graphic xmlns:a="http://schemas.openxmlformats.org/drawingml/2006/main">
+              <a:graphicData uri="http://schemas.openxmlformats.org/drawingml/2006/picture">
+                <pic:pic xmlns:pic="http://schemas.openxmlformats.org/drawingml/2006/picture">
+                  <pic:nvPicPr>
+                    <pic:cNvPr id="821278957" name=""/>
+                    <pic:cNvPicPr/>
+                  </pic:nvPicPr>
+                  <pic:blipFill>
+                    <a:blip r:embed="rId19"/>
+                    <a:stretch>
+                      <a:fillRect/>
+                    </a:stretch>
+                  </pic:blipFill>
+                  <pic:spPr>
+                    <a:xfrm>
+                      <a:off x="0" y="0"/>
+                      <a:ext cx="5731510" cy="1677670"/>
+                    </a:xfrm>
+                    <a:prstGeom prst="rect">
+                      <a:avLst/>
+                    </a:prstGeom>
+                  </pic:spPr>
+                </pic:pic>
+              </a:graphicData>
+            </a:graphic>
+          </wp:inline>
+        </w:drawing>
+      </w:r>
+    </w:p>
+    <w:p>
+      <w:r>
+        <w:t>CPU</w:t>
+      </w:r>
+    </w:p>
+    <w:p>
+      <w:r>
+        <w:drawing>
+          <wp:inline distT="0" distB="0" distL="0" distR="0" wp14:anchorId="54D2D53B" wp14:editId="7F9D3836">
+            <wp:extent cx="5731510" cy="3998595"/>
+            <wp:effectExtent l="0" t="0" r="2540" b="1905"/>
+            <wp:docPr id="1665521705" name="Picture 1"/>
+            <wp:cNvGraphicFramePr>
+              <a:graphicFrameLocks xmlns:a="http://schemas.openxmlformats.org/drawingml/2006/main" noChangeAspect="1"/>
+            </wp:cNvGraphicFramePr>
+            <a:graphic xmlns:a="http://schemas.openxmlformats.org/drawingml/2006/main">
+              <a:graphicData uri="http://schemas.openxmlformats.org/drawingml/2006/picture">
+                <pic:pic xmlns:pic="http://schemas.openxmlformats.org/drawingml/2006/picture">
+                  <pic:nvPicPr>
+                    <pic:cNvPr id="1665521705" name=""/>
+                    <pic:cNvPicPr/>
+                  </pic:nvPicPr>
+                  <pic:blipFill>
+                    <a:blip r:embed="rId20"/>
+                    <a:stretch>
+                      <a:fillRect/>
+                    </a:stretch>
+                  </pic:blipFill>
+                  <pic:spPr>
+                    <a:xfrm>
+                      <a:off x="0" y="0"/>
+                      <a:ext cx="5731510" cy="3998595"/>
+                    </a:xfrm>
+                    <a:prstGeom prst="rect">
+                      <a:avLst/>
+                    </a:prstGeom>
+                  </pic:spPr>
+                </pic:pic>
+              </a:graphicData>
+            </a:graphic>
+          </wp:inline>
+        </w:drawing>
+      </w:r>
+    </w:p>
+    <w:p>
+      <w:r>
+        <w:t>Divider Accelerator</w:t>
+      </w:r>
+    </w:p>
+    <w:p>
+      <w:r>
+        <w:drawing>
+          <wp:inline distT="0" distB="0" distL="0" distR="0" wp14:anchorId="538D3CFD" wp14:editId="21D7BA0B">
+            <wp:extent cx="5731510" cy="2124075"/>
+            <wp:effectExtent l="0" t="0" r="2540" b="9525"/>
+            <wp:docPr id="1774401982" name="Picture 1"/>
+            <wp:cNvGraphicFramePr>
+              <a:graphicFrameLocks xmlns:a="http://schemas.openxmlformats.org/drawingml/2006/main" noChangeAspect="1"/>
+            </wp:cNvGraphicFramePr>
+            <a:graphic xmlns:a="http://schemas.openxmlformats.org/drawingml/2006/main">
+              <a:graphicData uri="http://schemas.openxmlformats.org/drawingml/2006/picture">
+                <pic:pic xmlns:pic="http://schemas.openxmlformats.org/drawingml/2006/picture">
+                  <pic:nvPicPr>
+                    <pic:cNvPr id="1774401982" name=""/>
+                    <pic:cNvPicPr/>
+                  </pic:nvPicPr>
+                  <pic:blipFill>
+                    <a:blip r:embed="rId21"/>
+                    <a:stretch>
+                      <a:fillRect/>
+                    </a:stretch>
+                  </pic:blipFill>
+                  <pic:spPr>
+                    <a:xfrm>
+                      <a:off x="0" y="0"/>
+                      <a:ext cx="5731510" cy="2124075"/>
+                    </a:xfrm>
+                    <a:prstGeom prst="rect">
+                      <a:avLst/>
+                    </a:prstGeom>
+                  </pic:spPr>
+                </pic:pic>
+              </a:graphicData>
+            </a:graphic>
+          </wp:inline>
+        </w:drawing>
+      </w:r>
+    </w:p>
+    <w:p>
+      <w:r>
+        <w:lastRenderedPageBreak/>
+        <w:t>Dividing module</w:t>
+      </w:r>
+    </w:p>
+    <w:p>
+      <w:r>
+        <w:drawing>
+          <wp:inline distT="0" distB="0" distL="0" distR="0" wp14:anchorId="231D51A3" wp14:editId="2D78815E">
+            <wp:extent cx="5731510" cy="1301115"/>
+            <wp:effectExtent l="0" t="0" r="2540" b="0"/>
+            <wp:docPr id="1295702420" name="Picture 1"/>
+            <wp:cNvGraphicFramePr>
+              <a:graphicFrameLocks xmlns:a="http://schemas.openxmlformats.org/drawingml/2006/main" noChangeAspect="1"/>
+            </wp:cNvGraphicFramePr>
+            <a:graphic xmlns:a="http://schemas.openxmlformats.org/drawingml/2006/main">
+              <a:graphicData uri="http://schemas.openxmlformats.org/drawingml/2006/picture">
+                <pic:pic xmlns:pic="http://schemas.openxmlformats.org/drawingml/2006/picture">
+                  <pic:nvPicPr>
+                    <pic:cNvPr id="1295702420" name=""/>
+                    <pic:cNvPicPr/>
+                  </pic:nvPicPr>
+                  <pic:blipFill>
+                    <a:blip r:embed="rId22"/>
+                    <a:stretch>
+                      <a:fillRect/>
+                    </a:stretch>
+                  </pic:blipFill>
+                  <pic:spPr>
+                    <a:xfrm>
+                      <a:off x="0" y="0"/>
+                      <a:ext cx="5731510" cy="1301115"/>
+                    </a:xfrm>
+                    <a:prstGeom prst="rect">
+                      <a:avLst/>
+                    </a:prstGeom>
+                  </pic:spPr>
+                </pic:pic>
+              </a:graphicData>
+            </a:graphic>
+          </wp:inline>
+        </w:drawing>
+      </w:r>
+    </w:p>
+    <w:p>
+      <w:r>
+        <w:t>GPIO</w:t>
+      </w:r>
+    </w:p>
+    <w:p>
+      <w:r>
+        <w:drawing>
+          <wp:inline distT="0" distB="0" distL="0" distR="0" wp14:anchorId="3401F0BA" wp14:editId="62DFC6AD">
+            <wp:extent cx="5731510" cy="4267200"/>
+            <wp:effectExtent l="0" t="0" r="2540" b="0"/>
+            <wp:docPr id="938022902" name="Picture 1"/>
+            <wp:cNvGraphicFramePr>
+              <a:graphicFrameLocks xmlns:a="http://schemas.openxmlformats.org/drawingml/2006/main" noChangeAspect="1"/>
+            </wp:cNvGraphicFramePr>
+            <a:graphic xmlns:a="http://schemas.openxmlformats.org/drawingml/2006/main">
+              <a:graphicData uri="http://schemas.openxmlformats.org/drawingml/2006/picture">
+                <pic:pic xmlns:pic="http://schemas.openxmlformats.org/drawingml/2006/picture">
+                  <pic:nvPicPr>
+                    <pic:cNvPr id="938022902" name=""/>
+                    <pic:cNvPicPr/>
+                  </pic:nvPicPr>
+                  <pic:blipFill>
+                    <a:blip r:embed="rId23"/>
+                    <a:stretch>
+                      <a:fillRect/>
+                    </a:stretch>
+                  </pic:blipFill>
+                  <pic:spPr>
+                    <a:xfrm>
+                      <a:off x="0" y="0"/>
+                      <a:ext cx="5731510" cy="4267200"/>
+                    </a:xfrm>
+                    <a:prstGeom prst="rect">
+                      <a:avLst/>
+                    </a:prstGeom>
+                  </pic:spPr>
+                </pic:pic>
+              </a:graphicData>
+            </a:graphic>
+          </wp:inline>
+        </w:drawing>
+      </w:r>
+    </w:p>
+    <w:p>
+      <w:r>
+        <w:t>Basic Timer</w:t>
+      </w:r>
+    </w:p>
+    <w:p>
+      <w:r>
+        <w:drawing>
+          <wp:inline distT="0" distB="0" distL="0" distR="0" wp14:anchorId="182B70DD" wp14:editId="353F5EE5">
+            <wp:extent cx="5731510" cy="1993265"/>
+            <wp:effectExtent l="0" t="0" r="2540" b="6985"/>
+            <wp:docPr id="232666816" name="Picture 1"/>
+            <wp:cNvGraphicFramePr>
+              <a:graphicFrameLocks xmlns:a="http://schemas.openxmlformats.org/drawingml/2006/main" noChangeAspect="1"/>
+            </wp:cNvGraphicFramePr>
+            <a:graphic xmlns:a="http://schemas.openxmlformats.org/drawingml/2006/main">
+              <a:graphicData uri="http://schemas.openxmlformats.org/drawingml/2006/picture">
+                <pic:pic xmlns:pic="http://schemas.openxmlformats.org/drawingml/2006/picture">
+                  <pic:nvPicPr>
+                    <pic:cNvPr id="232666816" name=""/>
+                    <pic:cNvPicPr/>
+                  </pic:nvPicPr>
+                  <pic:blipFill>
+                    <a:blip r:embed="rId24"/>
+                    <a:stretch>
+                      <a:fillRect/>
+                    </a:stretch>
+                  </pic:blipFill>
+                  <pic:spPr>
+                    <a:xfrm>
+                      <a:off x="0" y="0"/>
+                      <a:ext cx="5731510" cy="1993265"/>
+                    </a:xfrm>
+                    <a:prstGeom prst="rect">
+                      <a:avLst/>
+                    </a:prstGeom>
+                  </pic:spPr>
+                </pic:pic>
+              </a:graphicData>
+            </a:graphic>
+          </wp:inline>
+        </w:drawing>
+      </w:r>
+    </w:p>
+    <w:p/>
     <w:sectPr>
       <w:pgSz w:w="11906" w:h="16838"/>
       <w:pgMar w:top="1440" w:right="1440" w:bottom="1440" w:left="1440" w:header="720" w:footer="720" w:gutter="0"/>

</xml_diff>